<commit_message>
Trim features, rename product to Simba
- Remove hidden terminal, stats-for-nerds and last-deployed tiles, shape label
  (and the terminal achievement: 15 -> 14)
- Logi Symphony -> Simba (renamed Sept 2026) on site and résumé v14;
  'Symphony Unification' -> 'Platform Unification'

Co-Authored-By: Claude Opus 5.5 <noreply@anthropic.com>
</commit_message>
<xml_diff>
--- a/Syed_Abdulla_Resume.docx
+++ b/Syed_Abdulla_Resume.docx
@@ -297,7 +297,27 @@
           <w:sz w:val="18"/>
           <w:szCs w:val="18"/>
         </w:rPr>
-        <w:t xml:space="preserve">Product: Logi Composer (Logi Symphony BI Platform)  |  </w:t>
+        <w:t xml:space="preserve">Product: </w:t>
+      </w:r>
+      <w:r>
+        <w:rPr>
+          <w:i/>
+          <w:iCs/>
+          <w:color w:val="555555"/>
+          <w:sz w:val="18"/>
+          <w:szCs w:val="18"/>
+        </w:rPr>
+        <w:t>Logi Composer (Simba BI Platform, formerly Logi Symphony)</w:t>
+      </w:r>
+      <w:r>
+        <w:rPr>
+          <w:i/>
+          <w:iCs/>
+          <w:color w:val="555555"/>
+          <w:sz w:val="18"/>
+          <w:szCs w:val="18"/>
+        </w:rPr>
+        <w:t xml:space="preserve">  |  </w:t>
       </w:r>
       <w:hyperlink r:id="rId8" w:history="1">
         <w:r>
@@ -522,7 +542,7 @@
           <w:b/>
           <w:bCs/>
         </w:rPr>
-        <w:t>Symphony Unification &amp; Homepage Revamp:</w:t>
+        <w:t>Platform Unification &amp; Homepage Revamp:</w:t>
       </w:r>
       <w:r>
         <w:t xml:space="preserve"> Spearheaded the homepage redesign into a task-focused interface with theming, consolidating </w:t>
@@ -1109,10 +1129,10 @@
 <file path=word/numbering.xml><?xml version="1.0" encoding="utf-8"?>
 <w:numbering xmlns:wpc="http://schemas.microsoft.com/office/word/2010/wordprocessingCanvas" xmlns:cx="http://schemas.microsoft.com/office/drawing/2014/chartex" xmlns:cx1="http://schemas.microsoft.com/office/drawing/2015/9/8/chartex" xmlns:cx2="http://schemas.microsoft.com/office/drawing/2015/10/21/chartex" xmlns:cx3="http://schemas.microsoft.com/office/drawing/2016/5/9/chartex" xmlns:cx4="http://schemas.microsoft.com/office/drawing/2016/5/10/chartex" xmlns:cx5="http://schemas.microsoft.com/office/drawing/2016/5/11/chartex" xmlns:cx6="http://schemas.microsoft.com/office/drawing/2016/5/12/chartex" xmlns:cx7="http://schemas.microsoft.com/office/drawing/2016/5/13/chartex" xmlns:cx8="http://schemas.microsoft.com/office/drawing/2016/5/14/chartex" xmlns:mc="http://schemas.openxmlformats.org/markup-compatibility/2006" xmlns:aink="http://schemas.microsoft.com/office/drawing/2016/ink" xmlns:am3d="http://schemas.microsoft.com/office/drawing/2017/model3d" xmlns:o="urn:schemas-microsoft-com:office:office" xmlns:oel="http://schemas.microsoft.com/office/2019/extlst" xmlns:r="http://schemas.openxmlformats.org/officeDocument/2006/relationships" xmlns:m="http://schemas.openxmlformats.org/officeDocument/2006/math" xmlns:v="urn:schemas-microsoft-com:vml" xmlns:wp14="http://schemas.microsoft.com/office/word/2010/wordprocessingDrawing" xmlns:wp="http://schemas.openxmlformats.org/drawingml/2006/wordprocessingDrawing" xmlns:w10="urn:schemas-microsoft-com:office:word" xmlns:w="http://schemas.openxmlformats.org/wordprocessingml/2006/main" xmlns:w14="http://schemas.microsoft.com/office/word/2010/wordml" xmlns:w15="http://schemas.microsoft.com/office/word/2012/wordml" xmlns:w16cex="http://schemas.microsoft.com/office/word/2018/wordml/cex" xmlns:w16cid="http://schemas.microsoft.com/office/word/2016/wordml/cid" xmlns:w16="http://schemas.microsoft.com/office/word/2018/wordml" xmlns:w16du="http://schemas.microsoft.com/office/word/2023/wordml/word16du" xmlns:w16sdtdh="http://schemas.microsoft.com/office/word/2020/wordml/sdtdatahash" xmlns:w16sdtfl="http://schemas.microsoft.com/office/word/2024/wordml/sdtformatlock" xmlns:w16se="http://schemas.microsoft.com/office/word/2015/wordml/symex" xmlns:wpg="http://schemas.microsoft.com/office/word/2010/wordprocessingGroup" xmlns:wpi="http://schemas.microsoft.com/office/word/2010/wordprocessingInk" xmlns:wne="http://schemas.microsoft.com/office/word/2006/wordml" xmlns:wps="http://schemas.microsoft.com/office/word/2010/wordprocessingShape" mc:Ignorable="w14 w15 w16se w16cid w16 w16cex w16sdtdh w16sdtfl w16du wp14">
   <w:abstractNum w:abstractNumId="0" w15:restartNumberingAfterBreak="0">
-    <w:nsid w:val="2F981D49"/>
+    <w:nsid w:val="13816286"/>
     <w:multiLevelType w:val="hybridMultilevel"/>
-    <w:tmpl w:val="AC248A2E"/>
-    <w:lvl w:ilvl="0" w:tplc="B12458F0">
+    <w:tmpl w:val="0B24A8EC"/>
+    <w:lvl w:ilvl="0" w:tplc="DA629E26">
       <w:start w:val="1"/>
       <w:numFmt w:val="bullet"/>
       <w:lvlText w:val="●"/>
@@ -1121,7 +1141,7 @@
         <w:ind w:left="720" w:hanging="360"/>
       </w:pPr>
     </w:lvl>
-    <w:lvl w:ilvl="1" w:tplc="85A469B0">
+    <w:lvl w:ilvl="1" w:tplc="B8EA5CAC">
       <w:start w:val="1"/>
       <w:numFmt w:val="bullet"/>
       <w:lvlText w:val="○"/>
@@ -1130,7 +1150,7 @@
         <w:ind w:left="1440" w:hanging="360"/>
       </w:pPr>
     </w:lvl>
-    <w:lvl w:ilvl="2" w:tplc="1222EE8A">
+    <w:lvl w:ilvl="2" w:tplc="B6D6D00C">
       <w:start w:val="1"/>
       <w:numFmt w:val="bullet"/>
       <w:lvlText w:val="■"/>
@@ -1139,7 +1159,7 @@
         <w:ind w:left="2160" w:hanging="360"/>
       </w:pPr>
     </w:lvl>
-    <w:lvl w:ilvl="3" w:tplc="CB04E004">
+    <w:lvl w:ilvl="3" w:tplc="EB084012">
       <w:start w:val="1"/>
       <w:numFmt w:val="bullet"/>
       <w:lvlText w:val="●"/>
@@ -1148,7 +1168,7 @@
         <w:ind w:left="2880" w:hanging="360"/>
       </w:pPr>
     </w:lvl>
-    <w:lvl w:ilvl="4" w:tplc="BA921EB4">
+    <w:lvl w:ilvl="4" w:tplc="53123130">
       <w:start w:val="1"/>
       <w:numFmt w:val="bullet"/>
       <w:lvlText w:val="○"/>
@@ -1157,7 +1177,7 @@
         <w:ind w:left="3600" w:hanging="360"/>
       </w:pPr>
     </w:lvl>
-    <w:lvl w:ilvl="5" w:tplc="27600B8E">
+    <w:lvl w:ilvl="5" w:tplc="7F8810F6">
       <w:start w:val="1"/>
       <w:numFmt w:val="bullet"/>
       <w:lvlText w:val="■"/>
@@ -1166,7 +1186,7 @@
         <w:ind w:left="4320" w:hanging="360"/>
       </w:pPr>
     </w:lvl>
-    <w:lvl w:ilvl="6" w:tplc="95927072">
+    <w:lvl w:ilvl="6" w:tplc="10A83B5A">
       <w:start w:val="1"/>
       <w:numFmt w:val="bullet"/>
       <w:lvlText w:val="●"/>
@@ -1175,7 +1195,7 @@
         <w:ind w:left="5040" w:hanging="360"/>
       </w:pPr>
     </w:lvl>
-    <w:lvl w:ilvl="7" w:tplc="4290FF32">
+    <w:lvl w:ilvl="7" w:tplc="5CF218AA">
       <w:start w:val="1"/>
       <w:numFmt w:val="bullet"/>
       <w:lvlText w:val="●"/>
@@ -1184,7 +1204,7 @@
         <w:ind w:left="5760" w:hanging="360"/>
       </w:pPr>
     </w:lvl>
-    <w:lvl w:ilvl="8" w:tplc="DAC2C886">
+    <w:lvl w:ilvl="8" w:tplc="78327210">
       <w:start w:val="1"/>
       <w:numFmt w:val="bullet"/>
       <w:lvlText w:val="●"/>
@@ -1195,10 +1215,10 @@
     </w:lvl>
   </w:abstractNum>
   <w:abstractNum w:abstractNumId="1" w15:restartNumberingAfterBreak="0">
-    <w:nsid w:val="32453EE5"/>
+    <w:nsid w:val="4B373EE8"/>
     <w:multiLevelType w:val="hybridMultilevel"/>
-    <w:tmpl w:val="13864FF4"/>
-    <w:lvl w:ilvl="0" w:tplc="D70C5E48">
+    <w:tmpl w:val="F40ADC46"/>
+    <w:lvl w:ilvl="0" w:tplc="F078AF46">
       <w:start w:val="1"/>
       <w:numFmt w:val="bullet"/>
       <w:lvlText w:val="•"/>
@@ -1211,54 +1231,54 @@
         <w:color w:val="2B5797"/>
       </w:rPr>
     </w:lvl>
-    <w:lvl w:ilvl="1" w:tplc="66E6DE38">
+    <w:lvl w:ilvl="1" w:tplc="BDEEECCE">
       <w:numFmt w:val="decimal"/>
       <w:lvlText w:val=""/>
       <w:lvlJc w:val="left"/>
     </w:lvl>
-    <w:lvl w:ilvl="2" w:tplc="8954CE9A">
+    <w:lvl w:ilvl="2" w:tplc="1D300032">
       <w:numFmt w:val="decimal"/>
       <w:lvlText w:val=""/>
       <w:lvlJc w:val="left"/>
     </w:lvl>
-    <w:lvl w:ilvl="3" w:tplc="7AA451CC">
+    <w:lvl w:ilvl="3" w:tplc="CB04FE46">
       <w:numFmt w:val="decimal"/>
       <w:lvlText w:val=""/>
       <w:lvlJc w:val="left"/>
     </w:lvl>
-    <w:lvl w:ilvl="4" w:tplc="65722756">
+    <w:lvl w:ilvl="4" w:tplc="89782C06">
       <w:numFmt w:val="decimal"/>
       <w:lvlText w:val=""/>
       <w:lvlJc w:val="left"/>
     </w:lvl>
-    <w:lvl w:ilvl="5" w:tplc="8F7AE3E6">
+    <w:lvl w:ilvl="5" w:tplc="4282F97C">
       <w:numFmt w:val="decimal"/>
       <w:lvlText w:val=""/>
       <w:lvlJc w:val="left"/>
     </w:lvl>
-    <w:lvl w:ilvl="6" w:tplc="98EC3DFC">
+    <w:lvl w:ilvl="6" w:tplc="B14C3062">
       <w:numFmt w:val="decimal"/>
       <w:lvlText w:val=""/>
       <w:lvlJc w:val="left"/>
     </w:lvl>
-    <w:lvl w:ilvl="7" w:tplc="6854BD1A">
+    <w:lvl w:ilvl="7" w:tplc="8E803040">
       <w:numFmt w:val="decimal"/>
       <w:lvlText w:val=""/>
       <w:lvlJc w:val="left"/>
     </w:lvl>
-    <w:lvl w:ilvl="8" w:tplc="1EAE40C4">
+    <w:lvl w:ilvl="8" w:tplc="672A13AA">
       <w:numFmt w:val="decimal"/>
       <w:lvlText w:val=""/>
       <w:lvlJc w:val="left"/>
     </w:lvl>
   </w:abstractNum>
-  <w:num w:numId="1" w16cid:durableId="716054646">
+  <w:num w:numId="1" w16cid:durableId="1125469177">
     <w:abstractNumId w:val="0"/>
     <w:lvlOverride w:ilvl="0">
       <w:startOverride w:val="1"/>
     </w:lvlOverride>
   </w:num>
-  <w:num w:numId="2" w16cid:durableId="1082604471">
+  <w:num w:numId="2" w16cid:durableId="690573338">
     <w:abstractNumId w:val="1"/>
     <w:lvlOverride w:ilvl="0">
       <w:startOverride w:val="1"/>
@@ -1872,7 +1892,7 @@
     <w:uiPriority w:val="99"/>
     <w:semiHidden/>
     <w:unhideWhenUsed/>
-    <w:rsid w:val="0051126B"/>
+    <w:rsid w:val="0007588E"/>
     <w:rPr>
       <w:color w:val="605E5C"/>
       <w:shd w:val="clear" w:color="auto" w:fill="E1DFDD"/>

</xml_diff>

<commit_message>
Add headshot, desktop-only game, résumé v15
- Photo (blazer version) in About, 30-sec summary, business card and og.png
- Exploration game (bugs, achievements, HUD, toasts) is desktop-only; phones
  stay uncluttered; shorter swipe hint on touch
- Résumé v15: sharper summary, tighter bullets; site serves the GCC variant
  with photo header and relocation line

Co-Authored-By: Claude Opus 5.5 <noreply@anthropic.com>
</commit_message>
<xml_diff>
--- a/Syed_Abdulla_Resume.docx
+++ b/Syed_Abdulla_Resume.docx
@@ -5,23 +5,88 @@
     <w:p>
       <w:pPr>
         <w:spacing w:after="20"/>
-        <w:jc w:val="center"/>
-      </w:pPr>
-      <w:r>
-        <w:rPr>
-          <w:b/>
-          <w:bCs/>
+        <w:ind w:left="1560"/>
+      </w:pPr>
+      <w:r>
+        <w:rPr>
+          <w:b/>
+          <w:bCs/>
+          <w:noProof/>
           <w:spacing w:val="40"/>
           <w:sz w:val="44"/>
           <w:szCs w:val="44"/>
         </w:rPr>
+        <w:drawing>
+          <wp:anchor distT="0" distB="0" distL="114300" distR="114300" simplePos="0" relativeHeight="251658240" behindDoc="0" locked="0" layoutInCell="1" allowOverlap="1" wp14:anchorId="28DB794A" wp14:editId="5EB14B2C">
+            <wp:simplePos x="0" y="0"/>
+            <wp:positionH relativeFrom="margin">
+              <wp:posOffset>0</wp:posOffset>
+            </wp:positionH>
+            <wp:positionV relativeFrom="margin">
+              <wp:posOffset>0</wp:posOffset>
+            </wp:positionV>
+            <wp:extent cx="838200" cy="838200"/>
+            <wp:effectExtent l="0" t="0" r="0" b="0"/>
+            <wp:wrapNone/>
+            <wp:docPr id="1293664364" name="Picture 1"/>
+            <wp:cNvGraphicFramePr>
+              <a:graphicFrameLocks xmlns:a="http://schemas.openxmlformats.org/drawingml/2006/main" noChangeAspect="1"/>
+            </wp:cNvGraphicFramePr>
+            <a:graphic xmlns:a="http://schemas.openxmlformats.org/drawingml/2006/main">
+              <a:graphicData uri="http://schemas.openxmlformats.org/drawingml/2006/picture">
+                <pic:pic xmlns:pic="http://schemas.openxmlformats.org/drawingml/2006/picture">
+                  <pic:nvPicPr>
+                    <pic:cNvPr id="1293664364" name=""/>
+                    <pic:cNvPicPr/>
+                  </pic:nvPicPr>
+                  <pic:blipFill>
+                    <a:blip r:embed="rId5" cstate="print">
+                      <a:extLst>
+                        <a:ext uri="{28A0092B-C50C-407E-A947-70E740481C1C}">
+                          <a14:useLocalDpi xmlns:a14="http://schemas.microsoft.com/office/drawing/2010/main" val="0"/>
+                        </a:ext>
+                      </a:extLst>
+                    </a:blip>
+                    <a:stretch>
+                      <a:fillRect/>
+                    </a:stretch>
+                  </pic:blipFill>
+                  <pic:spPr>
+                    <a:xfrm>
+                      <a:off x="0" y="0"/>
+                      <a:ext cx="838200" cy="838200"/>
+                    </a:xfrm>
+                    <a:prstGeom prst="rect">
+                      <a:avLst/>
+                    </a:prstGeom>
+                  </pic:spPr>
+                </pic:pic>
+              </a:graphicData>
+            </a:graphic>
+            <wp14:sizeRelH relativeFrom="margin">
+              <wp14:pctWidth>0</wp14:pctWidth>
+            </wp14:sizeRelH>
+            <wp14:sizeRelV relativeFrom="margin">
+              <wp14:pctHeight>0</wp14:pctHeight>
+            </wp14:sizeRelV>
+          </wp:anchor>
+        </w:drawing>
+      </w:r>
+      <w:r>
+        <w:rPr>
+          <w:b/>
+          <w:bCs/>
+          <w:spacing w:val="40"/>
+          <w:sz w:val="44"/>
+          <w:szCs w:val="44"/>
+        </w:rPr>
         <w:t>SYED ABDULLA</w:t>
       </w:r>
     </w:p>
     <w:p>
       <w:pPr>
         <w:spacing w:after="30"/>
-        <w:jc w:val="center"/>
+        <w:ind w:left="1560"/>
       </w:pPr>
       <w:r>
         <w:rPr>
@@ -31,13 +96,13 @@
           <w:sz w:val="21"/>
           <w:szCs w:val="21"/>
         </w:rPr>
-        <w:t>Software Engineer  |  Full-Stack  |  React · TypeScript · Java · Spring Boot</w:t>
-      </w:r>
-    </w:p>
-    <w:p>
-      <w:pPr>
-        <w:spacing w:after="20"/>
-        <w:jc w:val="center"/>
+        <w:t>Full-Stack Software Engineer  |  React · TypeScript · Java · Spring Boot  |  Open to GCC relocation</w:t>
+      </w:r>
+    </w:p>
+    <w:p>
+      <w:pPr>
+        <w:spacing w:after="270"/>
+        <w:ind w:left="1560"/>
       </w:pPr>
       <w:r>
         <w:rPr>
@@ -45,7 +110,7 @@
         </w:rPr>
         <w:t xml:space="preserve">Bengaluru, India  |  +91 88676 18049  |  </w:t>
       </w:r>
-      <w:hyperlink r:id="rId5" w:history="1">
+      <w:hyperlink r:id="rId6" w:history="1">
         <w:r>
           <w:rPr>
             <w:color w:val="2B5797"/>
@@ -59,7 +124,7 @@
         </w:rPr>
         <w:t xml:space="preserve">  |  </w:t>
       </w:r>
-      <w:hyperlink r:id="rId6" w:history="1">
+      <w:hyperlink r:id="rId7" w:history="1">
         <w:r>
           <w:rPr>
             <w:rStyle w:val="Hyperlink"/>
@@ -74,7 +139,7 @@
         </w:rPr>
         <w:t xml:space="preserve">  |  </w:t>
       </w:r>
-      <w:hyperlink r:id="rId7" w:history="1">
+      <w:hyperlink r:id="rId8" w:history="1">
         <w:r>
           <w:rPr>
             <w:rStyle w:val="Hyperlink"/>
@@ -109,27 +174,34 @@
         <w:spacing w:before="30" w:after="20"/>
       </w:pPr>
       <w:r>
-        <w:t xml:space="preserve">Software Engineer with </w:t>
-      </w:r>
-      <w:r>
-        <w:rPr>
-          <w:b/>
-          <w:bCs/>
+        <w:t xml:space="preserve">Full-stack Software Engineer with </w:t>
+      </w:r>
+      <w:r>
+        <w:rPr>
+          <w:b/>
         </w:rPr>
         <w:t>3+ years</w:t>
       </w:r>
       <w:r>
-        <w:t xml:space="preserve"> of experience specializing in high-performance React architectures and enterprise data visualization, now full-stack with Spring Boot. Independently owns high-impact features end-to-end — from library migrations and UI unifications to WCAG compliance — while maintaining </w:t>
-      </w:r>
-      <w:r>
-        <w:rPr>
-          <w:b/>
-          <w:bCs/>
-        </w:rPr>
-        <w:t>zero-spillover</w:t>
-      </w:r>
-      <w:r>
-        <w:t xml:space="preserve"> sprint delivery. UVCE CSE '23 (CGPA </w:t>
+        <w:t xml:space="preserve"> building Simba, insightsoftware’s enterprise embedded-analytics platform, across React/TypeScript front ends and Spring Boot services.</w:t>
+      </w:r>
+      <w:r>
+        <w:t xml:space="preserve"> </w:t>
+      </w:r>
+      <w:r>
+        <w:t xml:space="preserve">Built the public Playground (playground.simba.com) from scratch, led the AG-Grid v35 migration (−42% bundle) and has closed 305 Jira tickets with </w:t>
+      </w:r>
+      <w:r>
+        <w:rPr>
+          <w:b/>
+        </w:rPr>
+        <w:t>zero sprint spillover</w:t>
+      </w:r>
+      <w:r>
+        <w:t>.</w:t>
+      </w:r>
+      <w:r>
+        <w:t xml:space="preserve"> UVCE CSE '23 (CGPA </w:t>
       </w:r>
       <w:r>
         <w:rPr>
@@ -319,7 +391,7 @@
         </w:rPr>
         <w:t xml:space="preserve">  |  </w:t>
       </w:r>
-      <w:hyperlink r:id="rId8" w:history="1">
+      <w:hyperlink r:id="rId9" w:history="1">
         <w:r>
           <w:rPr>
             <w:i/>
@@ -377,7 +449,10 @@
         <w:t>AG-Grid Migration (v31 → v35):</w:t>
       </w:r>
       <w:r>
-        <w:t xml:space="preserve"> Led the enterprise-wide grid library upgrade across </w:t>
+        <w:t xml:space="preserve"> </w:t>
+      </w:r>
+      <w:r>
+        <w:t xml:space="preserve">Led the grid upgrade across </w:t>
       </w:r>
       <w:r>
         <w:rPr>
@@ -388,7 +463,7 @@
         <w:t>15+ modules</w:t>
       </w:r>
       <w:r>
-        <w:t xml:space="preserve"> to completion; authored a comprehensive spike document covering </w:t>
+        <w:t>: authored the spike (</w:t>
       </w:r>
       <w:r>
         <w:rPr>
@@ -399,7 +474,7 @@
         <w:t>50+ breaking changes</w:t>
       </w:r>
       <w:r>
-        <w:t xml:space="preserve">, migration strategy, and a phased </w:t>
+        <w:t xml:space="preserve">, </w:t>
       </w:r>
       <w:r>
         <w:rPr>
@@ -410,7 +485,7 @@
         <w:t>17-ticket</w:t>
       </w:r>
       <w:r>
-        <w:t xml:space="preserve"> roadmap, then migrated </w:t>
+        <w:t xml:space="preserve"> roadmap), migrated </w:t>
       </w:r>
       <w:r>
         <w:rPr>
@@ -432,7 +507,7 @@
         <w:t>30+ custom cell renderers</w:t>
       </w:r>
       <w:r>
-        <w:t xml:space="preserve">, moving to AG-Grid's modular v35 architecture; profiled the build and cut the grid bundle </w:t>
+        <w:t xml:space="preserve"> to the modular v35 architecture, and cut the grid bundle </w:t>
       </w:r>
       <w:r>
         <w:rPr>
@@ -443,7 +518,7 @@
         <w:t>42% (gzipped)</w:t>
       </w:r>
       <w:r>
-        <w:t xml:space="preserve"> by registering only the 15 modules in use and enabling cross-chunk dead-code elimination.</w:t>
+        <w:t xml:space="preserve"> by registering only the modules in use.</w:t>
       </w:r>
     </w:p>
     <w:p>
@@ -460,7 +535,7 @@
           <w:b/>
           <w:bCs/>
         </w:rPr>
-        <w:t>Folder Organization – Backend:</w:t>
+        <w:t>Folder Organization (Full-Stack):</w:t>
       </w:r>
       <w:r>
         <w:t xml:space="preserve"> Built the Spring Boot backend for hierarchical Library folders: JPA entities/DAOs, REST APIs and </w:t>
@@ -485,7 +560,10 @@
         <w:t>per-user private folders</w:t>
       </w:r>
       <w:r>
-        <w:t xml:space="preserve"> (~4K LOC): event-driven provisioning, Liquibase backfill, admin preview/execute migration, atomic sharing-driven moves.</w:t>
+        <w:t xml:space="preserve"> (~4K LOC): event-driven provisioning, Liquibase backfill, </w:t>
+      </w:r>
+      <w:r>
+        <w:t>admin preview/execute migration, atomic sharing-driven moves; plus the React Library tree, breadcrumbs and folder dialogs.</w:t>
       </w:r>
     </w:p>
     <w:p>
@@ -502,10 +580,10 @@
           <w:b/>
           <w:bCs/>
         </w:rPr>
-        <w:t>Folder Organization – UI:</w:t>
-      </w:r>
-      <w:r>
-        <w:t xml:space="preserve"> Own the React folder experience: Library tree sidebar with breadcrumbs, folder CRUD dialogs with system-folder badges, folder-first navigation and privilege roles.</w:t>
+        <w:t>SSR Embedding (End-to-End):</w:t>
+      </w:r>
+      <w:r>
+        <w:t xml:space="preserve"> Single-handedly delivered Self-Service Report embedding from spike to docs handover, enabling report embedding via Embed Manager with SDK events and embed snippets.</w:t>
       </w:r>
     </w:p>
     <w:p>
@@ -522,26 +600,6 @@
           <w:b/>
           <w:bCs/>
         </w:rPr>
-        <w:t>SSR Embedding (End-to-End):</w:t>
-      </w:r>
-      <w:r>
-        <w:t xml:space="preserve"> Single-handedly delivered Self-Service Report embedding from spike to docs handover, enabling report embedding via Embed Manager with SDK events and embed snippets.</w:t>
-      </w:r>
-    </w:p>
-    <w:p>
-      <w:pPr>
-        <w:pStyle w:val="ListParagraph"/>
-        <w:numPr>
-          <w:ilvl w:val="0"/>
-          <w:numId w:val="2"/>
-        </w:numPr>
-        <w:spacing w:after="22"/>
-      </w:pPr>
-      <w:r>
-        <w:rPr>
-          <w:b/>
-          <w:bCs/>
-        </w:rPr>
         <w:t>Platform Unification &amp; Homepage Revamp:</w:t>
       </w:r>
       <w:r>
@@ -556,7 +614,7 @@
         <w:t>5+ admin workflows</w:t>
       </w:r>
       <w:r>
-        <w:t xml:space="preserve"> into a unified experience. Key contributor to the broader product unification initiative.</w:t>
+        <w:t xml:space="preserve"> into a unified experience.</w:t>
       </w:r>
     </w:p>
     <w:p>

</xml_diff>

<commit_message>
Card QR saves contact; availability on résumé + summary
- Holo card QR now encodes a vCard (scan -> add contact) instead of the site URL
- Résumé v15 (both variants): labelled Availability line (60-day notice; GCC adds
  Indian national, valid passport, employer-sponsored visa); Release Maintenance
  emphasis limited to the two key numbers
- 30-sec summary: Availability row (+ Arabic)

Co-Authored-By: Claude Opus 5.5 <noreply@anthropic.com>
</commit_message>
<xml_diff>
--- a/Syed_Abdulla_Resume.docx
+++ b/Syed_Abdulla_Resume.docx
@@ -17,7 +17,7 @@
           <w:szCs w:val="44"/>
         </w:rPr>
         <w:drawing>
-          <wp:anchor distT="0" distB="0" distL="114300" distR="114300" simplePos="0" relativeHeight="251658240" behindDoc="0" locked="0" layoutInCell="1" allowOverlap="1" wp14:anchorId="28DB794A" wp14:editId="5EB14B2C">
+          <wp:anchor distT="0" distB="0" distL="114300" distR="114300" simplePos="0" relativeHeight="251658240" behindDoc="0" locked="0" layoutInCell="1" allowOverlap="1" wp14:anchorId="0248B15D" wp14:editId="5D17B9F9">
             <wp:simplePos x="0" y="0"/>
             <wp:positionH relativeFrom="margin">
               <wp:posOffset>0</wp:posOffset>
@@ -28,7 +28,7 @@
             <wp:extent cx="838200" cy="838200"/>
             <wp:effectExtent l="0" t="0" r="0" b="0"/>
             <wp:wrapNone/>
-            <wp:docPr id="1293664364" name="Picture 1"/>
+            <wp:docPr id="1452149169" name="Picture 1"/>
             <wp:cNvGraphicFramePr>
               <a:graphicFrameLocks xmlns:a="http://schemas.openxmlformats.org/drawingml/2006/main" noChangeAspect="1"/>
             </wp:cNvGraphicFramePr>
@@ -36,7 +36,7 @@
               <a:graphicData uri="http://schemas.openxmlformats.org/drawingml/2006/picture">
                 <pic:pic xmlns:pic="http://schemas.openxmlformats.org/drawingml/2006/picture">
                   <pic:nvPicPr>
-                    <pic:cNvPr id="1293664364" name=""/>
+                    <pic:cNvPr id="1452149169" name=""/>
                     <pic:cNvPicPr/>
                   </pic:nvPicPr>
                   <pic:blipFill>
@@ -777,7 +777,27 @@
           <w:bCs/>
           <w:color w:val="2B5797"/>
         </w:rPr>
-        <w:t>305 Jira tickets closed since 2023 (95 bugs, 4 technical spikes) and 89 backports across 11 supported releases</w:t>
+        <w:t>305 Jira tickets</w:t>
+      </w:r>
+      <w:r>
+        <w:rPr>
+          <w:bCs/>
+        </w:rPr>
+        <w:t xml:space="preserve"> closed since 2023 (95 bugs, 4 technical spikes) and </w:t>
+      </w:r>
+      <w:r>
+        <w:rPr>
+          <w:b/>
+          <w:bCs/>
+          <w:color w:val="2B5797"/>
+        </w:rPr>
+        <w:t>89 backports</w:t>
+      </w:r>
+      <w:r>
+        <w:rPr>
+          <w:bCs/>
+        </w:rPr>
+        <w:t xml:space="preserve"> across 11 supported releases</w:t>
       </w:r>
       <w:r>
         <w:t>, incl. customer escalations.</w:t>
@@ -1164,14 +1184,41 @@
     <w:p>
       <w:pPr>
         <w:spacing w:before="40"/>
-      </w:pPr>
-      <w:r>
         <w:rPr>
           <w:color w:val="555555"/>
           <w:sz w:val="18"/>
           <w:szCs w:val="18"/>
         </w:rPr>
+      </w:pPr>
+      <w:r>
+        <w:rPr>
+          <w:color w:val="555555"/>
+          <w:sz w:val="18"/>
+          <w:szCs w:val="18"/>
+        </w:rPr>
         <w:t>Languages: English (Professional) | Hindi (Professional) | Kannada (Native) | Telugu (Conversational)</w:t>
+      </w:r>
+    </w:p>
+    <w:p>
+      <w:pPr>
+        <w:spacing w:before="40"/>
+      </w:pPr>
+      <w:r>
+        <w:rPr>
+          <w:b/>
+          <w:color w:val="555555"/>
+          <w:sz w:val="18"/>
+          <w:szCs w:val="18"/>
+        </w:rPr>
+        <w:t>Availability:</w:t>
+      </w:r>
+      <w:r>
+        <w:rPr>
+          <w:color w:val="555555"/>
+          <w:sz w:val="18"/>
+          <w:szCs w:val="18"/>
+        </w:rPr>
+        <w:t xml:space="preserve"> Indian national (valid passport)  |  Notice period: 60 days  |  Ready to relocate on an employer-sponsored work visa</w:t>
       </w:r>
     </w:p>
     <w:sectPr>

</xml_diff>

<commit_message>
Precise ownership wording on site and résumé
- Playground: 'built from zero / ground up / scratch' -> 'own end-to-end'
  (EN + AR, meta description, og.png); worldwide-marketing detail kept
- Résumé v15: 'Implemented' per-user private folders; GCC phone marked WhatsApp
- CLAUDE.md records the wording rules

Co-Authored-By: Claude Opus 5.5 <noreply@anthropic.com>
</commit_message>
<xml_diff>
--- a/Syed_Abdulla_Resume.docx
+++ b/Syed_Abdulla_Resume.docx
@@ -17,7 +17,7 @@
           <w:szCs w:val="44"/>
         </w:rPr>
         <w:drawing>
-          <wp:anchor distT="0" distB="0" distL="114300" distR="114300" simplePos="0" relativeHeight="251658240" behindDoc="0" locked="0" layoutInCell="1" allowOverlap="1" wp14:anchorId="0248B15D" wp14:editId="5D17B9F9">
+          <wp:anchor distT="0" distB="0" distL="114300" distR="114300" simplePos="0" relativeHeight="251658240" behindDoc="0" locked="0" layoutInCell="1" allowOverlap="1" wp14:anchorId="197584D4" wp14:editId="081A7B0E">
             <wp:simplePos x="0" y="0"/>
             <wp:positionH relativeFrom="margin">
               <wp:posOffset>0</wp:posOffset>
@@ -28,7 +28,7 @@
             <wp:extent cx="838200" cy="838200"/>
             <wp:effectExtent l="0" t="0" r="0" b="0"/>
             <wp:wrapNone/>
-            <wp:docPr id="1452149169" name="Picture 1"/>
+            <wp:docPr id="2112633831" name="Picture 1"/>
             <wp:cNvGraphicFramePr>
               <a:graphicFrameLocks xmlns:a="http://schemas.openxmlformats.org/drawingml/2006/main" noChangeAspect="1"/>
             </wp:cNvGraphicFramePr>
@@ -36,7 +36,7 @@
               <a:graphicData uri="http://schemas.openxmlformats.org/drawingml/2006/picture">
                 <pic:pic xmlns:pic="http://schemas.openxmlformats.org/drawingml/2006/picture">
                   <pic:nvPicPr>
-                    <pic:cNvPr id="1452149169" name=""/>
+                    <pic:cNvPr id="2112633831" name=""/>
                     <pic:cNvPicPr/>
                   </pic:nvPicPr>
                   <pic:blipFill>
@@ -108,7 +108,19 @@
         <w:rPr>
           <w:color w:val="555555"/>
         </w:rPr>
-        <w:t xml:space="preserve">Bengaluru, India  |  +91 88676 18049  |  </w:t>
+        <w:t xml:space="preserve">Bengaluru, India  |  </w:t>
+      </w:r>
+      <w:r>
+        <w:rPr>
+          <w:color w:val="555555"/>
+        </w:rPr>
+        <w:t>+91 88676 18049 (WhatsApp)</w:t>
+      </w:r>
+      <w:r>
+        <w:rPr>
+          <w:color w:val="555555"/>
+        </w:rPr>
+        <w:t xml:space="preserve">  |  </w:t>
       </w:r>
       <w:hyperlink r:id="rId6" w:history="1">
         <w:r>
@@ -189,7 +201,7 @@
         <w:t xml:space="preserve"> </w:t>
       </w:r>
       <w:r>
-        <w:t xml:space="preserve">Built the public Playground (playground.simba.com) from scratch, led the AG-Grid v35 migration (−42% bundle) and has closed 305 Jira tickets with </w:t>
+        <w:t xml:space="preserve">Owns the public Playground (playground.simba.com) end-to-end, led the AG-Grid v35 migration (−42% bundle) and has closed 305 Jira tickets with </w:t>
       </w:r>
       <w:r>
         <w:rPr>
@@ -549,15 +561,10 @@
         <w:t>3 folder-scoped roles</w:t>
       </w:r>
       <w:r>
-        <w:t xml:space="preserve"> via a custom Spring Security ACL evaluator, advisory-lock name uniqueness and E2E auth tests. Designed </w:t>
-      </w:r>
-      <w:r>
-        <w:rPr>
-          <w:b/>
-          <w:bCs/>
-          <w:color w:val="2B5797"/>
-        </w:rPr>
-        <w:t>per-user private folders</w:t>
+        <w:t xml:space="preserve"> via a custom Spring Security ACL evaluator, advisory-lock name uniqueness and E2E auth tests. </w:t>
+      </w:r>
+      <w:r>
+        <w:t>Implemented per-user private folders</w:t>
       </w:r>
       <w:r>
         <w:t xml:space="preserve"> (~4K LOC): event-driven provisioning, Liquibase backfill, </w:t>
@@ -882,13 +889,10 @@
         <w:t xml:space="preserve"> </w:t>
       </w:r>
       <w:r>
-        <w:t>Built the public Playground (React + Spring Boot) from the ground up,</w:t>
-      </w:r>
-      <w:r>
-        <w:t xml:space="preserve"> </w:t>
-      </w:r>
-      <w:r>
-        <w:t>publicly deployed and marketed worldwide at playground.simba.com as the product sandbox for insightsoftware’s thousands of client companies.</w:t>
+        <w:t>Own the public Playground (React + Spring Boot) end-to-end, publicly deployed</w:t>
+      </w:r>
+      <w:r>
+        <w:t xml:space="preserve"> and marketed worldwide at playground.simba.com as the product sandbox for insightsoftware’s thousands of client companies.</w:t>
       </w:r>
     </w:p>
     <w:p>

</xml_diff>

<commit_message>
Frontend-first positioning on site and résumé
- Headline/title: Frontend Software Engineer (React · TypeScript), full-stack
  with Spring Boot; backend kept as a supporting strength
- Site (EN + AR), meta/OG/JSON-LD, card, QR vCard, .vcf, manifest, og.png
- Résumé v15 India + GCC headlines and summary; CLAUDE.md records the decision

Co-Authored-By: Claude Opus 5.5 <noreply@anthropic.com>
</commit_message>
<xml_diff>
--- a/Syed_Abdulla_Resume.docx
+++ b/Syed_Abdulla_Resume.docx
@@ -17,7 +17,7 @@
           <w:szCs w:val="44"/>
         </w:rPr>
         <w:drawing>
-          <wp:anchor distT="0" distB="0" distL="114300" distR="114300" simplePos="0" relativeHeight="251658240" behindDoc="0" locked="0" layoutInCell="1" allowOverlap="1" wp14:anchorId="197584D4" wp14:editId="081A7B0E">
+          <wp:anchor distT="0" distB="0" distL="114300" distR="114300" simplePos="0" relativeHeight="251658240" behindDoc="0" locked="0" layoutInCell="1" allowOverlap="1" wp14:anchorId="6FA5CD21" wp14:editId="5E8658EE">
             <wp:simplePos x="0" y="0"/>
             <wp:positionH relativeFrom="margin">
               <wp:posOffset>0</wp:posOffset>
@@ -28,7 +28,7 @@
             <wp:extent cx="838200" cy="838200"/>
             <wp:effectExtent l="0" t="0" r="0" b="0"/>
             <wp:wrapNone/>
-            <wp:docPr id="2112633831" name="Picture 1"/>
+            <wp:docPr id="1354552193" name="Picture 1"/>
             <wp:cNvGraphicFramePr>
               <a:graphicFrameLocks xmlns:a="http://schemas.openxmlformats.org/drawingml/2006/main" noChangeAspect="1"/>
             </wp:cNvGraphicFramePr>
@@ -36,7 +36,7 @@
               <a:graphicData uri="http://schemas.openxmlformats.org/drawingml/2006/picture">
                 <pic:pic xmlns:pic="http://schemas.openxmlformats.org/drawingml/2006/picture">
                   <pic:nvPicPr>
-                    <pic:cNvPr id="2112633831" name=""/>
+                    <pic:cNvPr id="1354552193" name=""/>
                     <pic:cNvPicPr/>
                   </pic:nvPicPr>
                   <pic:blipFill>
@@ -96,7 +96,7 @@
           <w:sz w:val="21"/>
           <w:szCs w:val="21"/>
         </w:rPr>
-        <w:t>Full-Stack Software Engineer  |  React · TypeScript · Java · Spring Boot  |  Open to GCC relocation</w:t>
+        <w:t>Software Engineer  |  Frontend (React · TypeScript) · Full-Stack  |  Open to GCC relocation</w:t>
       </w:r>
     </w:p>
     <w:p>
@@ -186,7 +186,7 @@
         <w:spacing w:before="30" w:after="20"/>
       </w:pPr>
       <w:r>
-        <w:t xml:space="preserve">Full-stack Software Engineer with </w:t>
+        <w:t xml:space="preserve">Frontend-focused Software Engineer with </w:t>
       </w:r>
       <w:r>
         <w:rPr>
@@ -195,7 +195,7 @@
         <w:t>3+ years</w:t>
       </w:r>
       <w:r>
-        <w:t xml:space="preserve"> building Simba, insightsoftware’s enterprise embedded-analytics platform, across React/TypeScript front ends and Spring Boot services.</w:t>
+        <w:t xml:space="preserve"> building Simba, insightsoftware’s enterprise embedded-analytics platform: React/TypeScript architecture, data-heavy AG-Grid UIs and WCAG accessibility, with hands-on Spring Boot backend experience.</w:t>
       </w:r>
       <w:r>
         <w:t xml:space="preserve"> </w:t>

</xml_diff>